<commit_message>
docs: add repository URL to assessment report files
</commit_message>
<xml_diff>
--- a/Agentic_AI_Project_Report.docx
+++ b/Agentic_AI_Project_Report.docx
@@ -1521,12 +1521,22 @@
       <w:r>
         <w:rPr>
           <w:rFonts w:ascii="Calibri" w:hAnsi="Calibri"/>
+          <w:b/>
+          <w:i w:val="0"/>
+          <w:color w:val="2D3748"/>
+          <w:sz w:val="22"/>
+        </w:rPr>
+        <w:t>Repository URL:</w:t>
+      </w:r>
+      <w:r>
+        <w:rPr>
+          <w:rFonts w:ascii="Calibri" w:hAnsi="Calibri"/>
           <w:b w:val="0"/>
           <w:i w:val="0"/>
           <w:color w:val="2D3748"/>
           <w:sz w:val="22"/>
         </w:rPr>
-        <w:t>Repository URL: ____________________________________________________________________</w:t>
+        <w:t xml:space="preserve"> https://github.com/Srishtiops/agentic-budget-planner.git</w:t>
       </w:r>
     </w:p>
     <w:p>

</xml_diff>